<commit_message>
Add example dataset downloads to Data Guide, update manual v1.1
</commit_message>
<xml_diff>
--- a/NCA_Assistant_User_Manual_v1.1.docx
+++ b/NCA_Assistant_User_Manual_v1.1.docx
@@ -5235,7 +5235,57 @@
           <w:sz w:val="22"/>
           <w:szCs w:val="22"/>
         </w:rPr>
-        <w:t xml:space="preserve">Save the R built-in dataset: </w:t>
+        <w:t xml:space="preserve">The theophylline dataset contains concentration–time data for 12 subjects who each received a single 320 mg oral dose. Download the file from the app: open the </w:t>
+      </w:r>
+      <w:r>
+        <w:rPr>
+          <w:rFonts w:ascii="Arial" w:cs="Arial" w:eastAsia="Arial" w:hAnsi="Arial"/>
+          <w:b/>
+          <w:bCs/>
+          <w:sz w:val="22"/>
+          <w:szCs w:val="22"/>
+        </w:rPr>
+        <w:t xml:space="preserve">Data Preparation Guide</w:t>
+      </w:r>
+      <w:r>
+        <w:rPr>
+          <w:rFonts w:ascii="Arial" w:cs="Arial" w:eastAsia="Arial" w:hAnsi="Arial"/>
+          <w:sz w:val="22"/>
+          <w:szCs w:val="22"/>
+        </w:rPr>
+        <w:t xml:space="preserve"> (button in the top navigation bar) and click </w:t>
+      </w:r>
+      <w:r>
+        <w:rPr>
+          <w:rFonts w:ascii="Arial" w:cs="Arial" w:eastAsia="Arial" w:hAnsi="Arial"/>
+          <w:b/>
+          <w:bCs/>
+          <w:sz w:val="22"/>
+          <w:szCs w:val="22"/>
+        </w:rPr>
+        <w:t xml:space="preserve">Download theoph.csv</w:t>
+      </w:r>
+      <w:r>
+        <w:rPr>
+          <w:rFonts w:ascii="Arial" w:cs="Arial" w:eastAsia="Arial" w:hAnsi="Arial"/>
+          <w:sz w:val="22"/>
+          <w:szCs w:val="22"/>
+        </w:rPr>
+        <w:t xml:space="preserve"> in the Example Datasets section at the top of the page.</w:t>
+      </w:r>
+    </w:p>
+    <w:p>
+      <w:pPr>
+        <w:spacing w:after="80" w:line="276"/>
+      </w:pPr>
+      <w:r>
+        <w:rPr>
+          <w:rFonts w:ascii="Arial" w:cs="Arial" w:eastAsia="Arial" w:hAnsi="Arial"/>
+          <w:color w:val="555555"/>
+          <w:sz w:val="20"/>
+          <w:szCs w:val="20"/>
+        </w:rPr>
+        <w:t xml:space="preserve">Alternatively, if you have R installed: </w:t>
       </w:r>
       <w:r>
         <w:rPr>
@@ -5322,7 +5372,43 @@
           <w:sz w:val="22"/>
           <w:szCs w:val="22"/>
         </w:rPr>
-        <w:t xml:space="preserve">Upload example_be_crossover.csv. Map columns. Set dose = 100, design = 2-period crossover. Run.</w:t>
+        <w:t xml:space="preserve">Download the crossover BE example dataset from the </w:t>
+      </w:r>
+      <w:r>
+        <w:rPr>
+          <w:rFonts w:ascii="Arial" w:cs="Arial" w:eastAsia="Arial" w:hAnsi="Arial"/>
+          <w:b/>
+          <w:bCs/>
+          <w:sz w:val="22"/>
+          <w:szCs w:val="22"/>
+        </w:rPr>
+        <w:t xml:space="preserve">Data Preparation Guide</w:t>
+      </w:r>
+      <w:r>
+        <w:rPr>
+          <w:rFonts w:ascii="Arial" w:cs="Arial" w:eastAsia="Arial" w:hAnsi="Arial"/>
+          <w:sz w:val="22"/>
+          <w:szCs w:val="22"/>
+        </w:rPr>
+        <w:t xml:space="preserve"> (click </w:t>
+      </w:r>
+      <w:r>
+        <w:rPr>
+          <w:rFonts w:ascii="Arial" w:cs="Arial" w:eastAsia="Arial" w:hAnsi="Arial"/>
+          <w:b/>
+          <w:bCs/>
+          <w:sz w:val="22"/>
+          <w:szCs w:val="22"/>
+        </w:rPr>
+        <w:t xml:space="preserve">Download crossover_be.csv</w:t>
+      </w:r>
+      <w:r>
+        <w:rPr>
+          <w:rFonts w:ascii="Arial" w:cs="Arial" w:eastAsia="Arial" w:hAnsi="Arial"/>
+          <w:sz w:val="22"/>
+          <w:szCs w:val="22"/>
+        </w:rPr>
+        <w:t xml:space="preserve"> in the Example Datasets section). Upload it to the app. Map columns. Set dose = 100, design = 2-period crossover. Run.</w:t>
       </w:r>
     </w:p>
     <w:p>

</xml_diff>